<commit_message>
Finalise boundary fixes and SEO updates
</commit_message>
<xml_diff>
--- a/Code Notes.docx
+++ b/Code Notes.docx
@@ -77,7 +77,15 @@
         <w:t>“</w:t>
       </w:r>
       <w:r>
-        <w:t>Am I in zone?" address checker The single most valuable feature. I type my potential rental address and it instantly tells me which secondary school I'm zoned for. No clicking around the map trying to guess which polygon I'm inside. This is the core job-to-be-done and should be front and centre, not buried.</w:t>
+        <w:t xml:space="preserve">Am I in zone?" address checker The single most valuable feature. I type my potential rental </w:t>
+      </w:r>
+      <w:proofErr w:type="gramStart"/>
+      <w:r>
+        <w:t>address</w:t>
+      </w:r>
+      <w:proofErr w:type="gramEnd"/>
+      <w:r>
+        <w:t xml:space="preserve"> and it instantly tells me which secondary school I'm zoned for. No clicking around the map trying to guess which polygon I'm inside. This is the core job-to-be-done and should be front and centre, not buried.</w:t>
       </w:r>
     </w:p>
     <w:p>
@@ -95,78 +103,59 @@
         <w:rPr>
           <w:lang w:val="en-US"/>
         </w:rPr>
-        <w:t>Rental overlay or integration</w:t>
-      </w:r>
-      <w:r>
-        <w:rPr>
-          <w:lang w:val="en-US"/>
-        </w:rPr>
-        <w:t xml:space="preserve"> - </w:t>
-      </w:r>
-      <w:r>
-        <w:rPr>
-          <w:lang w:val="en-US"/>
-        </w:rPr>
-        <w:t>Even a rough suburb median rent layer (from Domain/REA open data) shaded over the catchment polygons would be transformative. "Zone for school X, median rent $680/</w:t>
+        <w:t xml:space="preserve">Saved shortlist / comparison - Let me pin 3–4 schools and see their catchment zones simultaneously, </w:t>
       </w:r>
       <w:proofErr w:type="spellStart"/>
       <w:r>
         <w:rPr>
           <w:lang w:val="en-US"/>
         </w:rPr>
-        <w:t>wk</w:t>
+        <w:t>colour</w:t>
       </w:r>
       <w:proofErr w:type="spellEnd"/>
       <w:r>
         <w:rPr>
           <w:lang w:val="en-US"/>
         </w:rPr>
-        <w:t>" visible at a glance. This is the feature that no existing tool offers and would make this genuinely unique</w:t>
+        <w:t xml:space="preserve">-coded. Right </w:t>
+      </w:r>
+      <w:proofErr w:type="gramStart"/>
+      <w:r>
+        <w:rPr>
+          <w:lang w:val="en-US"/>
+        </w:rPr>
+        <w:t>now</w:t>
+      </w:r>
+      <w:proofErr w:type="gramEnd"/>
+      <w:r>
+        <w:rPr>
+          <w:lang w:val="en-US"/>
+        </w:rPr>
+        <w:t xml:space="preserve"> the map clears the boundary when you click another school. For </w:t>
+      </w:r>
+      <w:proofErr w:type="gramStart"/>
+      <w:r>
+        <w:rPr>
+          <w:lang w:val="en-US"/>
+        </w:rPr>
+        <w:t>this use</w:t>
+      </w:r>
+      <w:proofErr w:type="gramEnd"/>
+      <w:r>
+        <w:rPr>
+          <w:lang w:val="en-US"/>
+        </w:rPr>
+        <w:t xml:space="preserve"> case I want to see overlapping zones and compare them side by side.</w:t>
       </w:r>
     </w:p>
     <w:p>
       <w:pPr>
-        <w:pStyle w:val="ListParagraph"/>
-        <w:numPr>
-          <w:ilvl w:val="0"/>
-          <w:numId w:val="2"/>
-        </w:numPr>
-        <w:rPr>
-          <w:lang w:val="en-US"/>
-        </w:rPr>
-      </w:pPr>
-      <w:r>
-        <w:rPr>
-          <w:lang w:val="en-US"/>
-        </w:rPr>
-        <w:t>Saved shortlist / comparison</w:t>
-      </w:r>
-      <w:r>
-        <w:rPr>
-          <w:lang w:val="en-US"/>
-        </w:rPr>
-        <w:t xml:space="preserve"> - </w:t>
-      </w:r>
-      <w:r>
-        <w:rPr>
-          <w:lang w:val="en-US"/>
-        </w:rPr>
-        <w:t xml:space="preserve">Let me pin 3–4 schools and see their catchment zones simultaneously, </w:t>
-      </w:r>
-      <w:proofErr w:type="spellStart"/>
-      <w:r>
-        <w:rPr>
-          <w:lang w:val="en-US"/>
-        </w:rPr>
-        <w:t>colour</w:t>
-      </w:r>
-      <w:proofErr w:type="spellEnd"/>
-      <w:r>
-        <w:rPr>
-          <w:lang w:val="en-US"/>
-        </w:rPr>
-        <w:t>-coded. Right now the map clears the boundary when you click another school. For this use case I want to see overlapping zones and compare them side by side.</w:t>
-      </w:r>
+        <w:rPr>
+          <w:b/>
+          <w:bCs/>
+          <w:lang w:val="en-US"/>
+        </w:rPr>
+      </w:pPr>
     </w:p>
     <w:p>
       <w:pPr>
@@ -176,22 +165,26 @@
           <w:lang w:val="en-US"/>
         </w:rPr>
       </w:pPr>
+      <w:r>
+        <w:rPr>
+          <w:b/>
+          <w:bCs/>
+          <w:lang w:val="en-US"/>
+        </w:rPr>
+        <w:t>Script to run when ne boundary zip is downloaded:</w:t>
+      </w:r>
     </w:p>
     <w:p>
       <w:pPr>
         <w:rPr>
-          <w:b/>
-          <w:bCs/>
-          <w:lang w:val="en-US"/>
-        </w:rPr>
-      </w:pPr>
-      <w:r>
-        <w:rPr>
-          <w:b/>
-          <w:bCs/>
-          <w:lang w:val="en-US"/>
-        </w:rPr>
-        <w:t>Script to run when ne boundary zip is downloaded:</w:t>
+          <w:lang w:val="en-US"/>
+        </w:rPr>
+      </w:pPr>
+      <w:r>
+        <w:rPr>
+          <w:lang w:val="en-US"/>
+        </w:rPr>
+        <w:t># Install ogr2ogr if you don't have it (part of GDAL)</w:t>
       </w:r>
     </w:p>
     <w:p>
@@ -204,7 +197,21 @@
         <w:rPr>
           <w:lang w:val="en-US"/>
         </w:rPr>
-        <w:t># Install ogr2ogr if you don't have it (part of GDAL)</w:t>
+        <w:t xml:space="preserve">brew install </w:t>
+      </w:r>
+      <w:proofErr w:type="spellStart"/>
+      <w:r>
+        <w:rPr>
+          <w:lang w:val="en-US"/>
+        </w:rPr>
+        <w:t>gdal</w:t>
+      </w:r>
+      <w:proofErr w:type="spellEnd"/>
+      <w:r>
+        <w:rPr>
+          <w:lang w:val="en-US"/>
+        </w:rPr>
+        <w:t xml:space="preserve">   # macOS</w:t>
       </w:r>
     </w:p>
     <w:p>
@@ -217,13 +224,27 @@
         <w:rPr>
           <w:lang w:val="en-US"/>
         </w:rPr>
-        <w:t xml:space="preserve">brew install </w:t>
+        <w:t xml:space="preserve"># or: </w:t>
       </w:r>
       <w:proofErr w:type="spellStart"/>
       <w:r>
         <w:rPr>
           <w:lang w:val="en-US"/>
         </w:rPr>
+        <w:t>sudo</w:t>
+      </w:r>
+      <w:proofErr w:type="spellEnd"/>
+      <w:r>
+        <w:rPr>
+          <w:lang w:val="en-US"/>
+        </w:rPr>
+        <w:t xml:space="preserve"> apt install </w:t>
+      </w:r>
+      <w:proofErr w:type="spellStart"/>
+      <w:r>
+        <w:rPr>
+          <w:lang w:val="en-US"/>
+        </w:rPr>
         <w:t>gdal</w:t>
       </w:r>
       <w:proofErr w:type="spellEnd"/>
@@ -231,48 +252,21 @@
         <w:rPr>
           <w:lang w:val="en-US"/>
         </w:rPr>
-        <w:t xml:space="preserve">   # macOS</w:t>
-      </w:r>
-    </w:p>
-    <w:p>
-      <w:pPr>
-        <w:rPr>
-          <w:lang w:val="en-US"/>
-        </w:rPr>
-      </w:pPr>
-      <w:r>
-        <w:rPr>
-          <w:lang w:val="en-US"/>
-        </w:rPr>
-        <w:t xml:space="preserve"># or: </w:t>
-      </w:r>
-      <w:proofErr w:type="spellStart"/>
-      <w:r>
-        <w:rPr>
-          <w:lang w:val="en-US"/>
-        </w:rPr>
-        <w:t>sudo</w:t>
-      </w:r>
-      <w:proofErr w:type="spellEnd"/>
-      <w:r>
-        <w:rPr>
-          <w:lang w:val="en-US"/>
-        </w:rPr>
-        <w:t xml:space="preserve"> apt install </w:t>
-      </w:r>
-      <w:proofErr w:type="spellStart"/>
-      <w:r>
-        <w:rPr>
-          <w:lang w:val="en-US"/>
-        </w:rPr>
-        <w:t>gdal</w:t>
-      </w:r>
-      <w:proofErr w:type="spellEnd"/>
-      <w:r>
-        <w:rPr>
-          <w:lang w:val="en-US"/>
-        </w:rPr>
-        <w:t>-bin   (Linux)</w:t>
+        <w:t>-bin</w:t>
+      </w:r>
+      <w:proofErr w:type="gramStart"/>
+      <w:r>
+        <w:rPr>
+          <w:lang w:val="en-US"/>
+        </w:rPr>
+        <w:t xml:space="preserve">   (</w:t>
+      </w:r>
+      <w:proofErr w:type="gramEnd"/>
+      <w:r>
+        <w:rPr>
+          <w:lang w:val="en-US"/>
+        </w:rPr>
+        <w:t>Linux)</w:t>
       </w:r>
     </w:p>
     <w:p>
@@ -2308,6 +2302,7 @@
   <w:style w:type="character" w:default="1" w:styleId="DefaultParagraphFont">
     <w:name w:val="Default Paragraph Font"/>
     <w:uiPriority w:val="1"/>
+    <w:semiHidden/>
     <w:unhideWhenUsed/>
   </w:style>
   <w:style w:type="table" w:default="1" w:styleId="TableNormal">

</xml_diff>